<commit_message>
style: update Portfolio document template and regenerate Portfolio docx
Co-Authored-By: Claude <noreply@anthropic.com>
</commit_message>
<xml_diff>
--- a/data/ko/HyeonseungKang-Portfolio.docx
+++ b/data/ko/HyeonseungKang-Portfolio.docx
@@ -58,11 +58,13 @@
               <w:ind w:leftChars="8" w:left="14"/>
               <w:jc w:val="both"/>
               <w:rPr>
+                <w:rFonts w:ascii="NanumGothic" w:hAnsi="NanumGothic"/>
                 <w:szCs w:val="20"/>
               </w:rPr>
             </w:pPr>
             <w:r>
               <w:rPr>
+                <w:rFonts w:ascii="NanumGothic" w:hAnsi="NanumGothic"/>
                 <w:b/>
                 <w:bCs/>
                 <w:szCs w:val="20"/>
@@ -71,6 +73,7 @@
             </w:r>
             <w:r>
               <w:rPr>
+                <w:rFonts w:ascii="NanumGothic" w:hAnsi="NanumGothic"/>
                 <w:szCs w:val="20"/>
               </w:rPr>
               <w:t xml:space="preserve"> </w:t>
@@ -79,6 +82,7 @@
               <w:r>
                 <w:rPr>
                   <w:rStyle w:val="ab"/>
+                  <w:rFonts w:ascii="NanumGothic" w:hAnsi="NanumGothic"/>
                   <w:szCs w:val="20"/>
                 </w:rPr>
                 <w:t>hyeonseungkang@outlook.com</w:t>
@@ -90,11 +94,13 @@
               <w:ind w:leftChars="8" w:left="14"/>
               <w:jc w:val="both"/>
               <w:rPr>
+                <w:rFonts w:ascii="NanumGothic" w:hAnsi="NanumGothic"/>
                 <w:szCs w:val="20"/>
               </w:rPr>
             </w:pPr>
             <w:r>
               <w:rPr>
+                <w:rFonts w:ascii="NanumGothic" w:hAnsi="NanumGothic"/>
                 <w:b/>
                 <w:bCs/>
                 <w:szCs w:val="20"/>
@@ -103,31 +109,35 @@
             </w:r>
             <w:r>
               <w:rPr>
+                <w:rFonts w:ascii="NanumGothic" w:hAnsi="NanumGothic"/>
                 <w:szCs w:val="20"/>
               </w:rPr>
               <w:t xml:space="preserve"> +8210</w:t>
             </w:r>
             <w:r>
               <w:rPr>
+                <w:rFonts w:ascii="NanumGothic" w:hAnsi="NanumGothic"/>
                 <w:szCs w:val="20"/>
               </w:rPr>
               <w:t>5934</w:t>
             </w:r>
             <w:r>
               <w:rPr>
+                <w:rFonts w:ascii="NanumGothic" w:hAnsi="NanumGothic"/>
                 <w:szCs w:val="20"/>
               </w:rPr>
               <w:t>055</w:t>
             </w:r>
             <w:r>
               <w:rPr>
+                <w:rFonts w:ascii="NanumGothic" w:hAnsi="NanumGothic"/>
                 <w:szCs w:val="20"/>
               </w:rPr>
               <w:t>2</w:t>
             </w:r>
             <w:r>
               <w:rPr>
-                <w:rFonts w:hint="eastAsia"/>
+                <w:rFonts w:ascii="NanumGothic" w:hAnsi="NanumGothic" w:hint="eastAsia"/>
                 <w:szCs w:val="20"/>
               </w:rPr>
               <w:t xml:space="preserve"> </w:t>
@@ -143,6 +153,7 @@
             </w:pPr>
             <w:r>
               <w:rPr>
+                <w:rFonts w:ascii="NanumGothic" w:hAnsi="NanumGothic"/>
                 <w:b/>
                 <w:bCs/>
                 <w:szCs w:val="20"/>
@@ -151,6 +162,7 @@
             </w:r>
             <w:r>
               <w:rPr>
+                <w:rFonts w:ascii="NanumGothic" w:hAnsi="NanumGothic"/>
                 <w:szCs w:val="20"/>
               </w:rPr>
               <w:t xml:space="preserve"> </w:t>
@@ -159,6 +171,7 @@
               <w:r>
                 <w:rPr>
                   <w:rStyle w:val="ab"/>
+                  <w:rFonts w:ascii="NanumGothic" w:hAnsi="NanumGothic"/>
                   <w:szCs w:val="20"/>
                 </w:rPr>
                 <w:t>https://hyeonseungkang.github.io</w:t>
@@ -166,6 +179,7 @@
             </w:hyperlink>
             <w:r>
               <w:rPr>
+                <w:rFonts w:ascii="NanumGothic" w:hAnsi="NanumGothic"/>
                 <w:szCs w:val="20"/>
               </w:rPr>
               <w:t xml:space="preserve"> </w:t>
@@ -178,9 +192,6 @@
     <w:p>
       <w:pPr>
         <w:pStyle w:val="2"/>
-        <w:rPr>
-          <w:rFonts w:hint="eastAsia"/>
-        </w:rPr>
       </w:pPr>
       <w:r>
         <w:rPr>
@@ -201,6 +212,12 @@
           <w:insideH w:val="none" w:sz="0" w:space="0" w:color="auto"/>
           <w:insideV w:val="none" w:sz="0" w:space="0" w:color="auto"/>
         </w:tblBorders>
+        <w:tblCellMar>
+          <w:top w:w="57" w:type="dxa"/>
+          <w:left w:w="57" w:type="dxa"/>
+          <w:bottom w:w="57" w:type="dxa"/>
+          <w:right w:w="57" w:type="dxa"/>
+        </w:tblCellMar>
         <w:tblLook w:val="04A0" w:firstRow="1" w:lastRow="0" w:firstColumn="1" w:lastColumn="0" w:noHBand="0" w:noVBand="1"/>
       </w:tblPr>
       <w:tblGrid>
@@ -215,7 +232,6 @@
           <w:p>
             <w:pPr>
               <w:rPr>
-                <w:rFonts w:hint="eastAsia"/>
                 <w:szCs w:val="18"/>
               </w:rPr>
             </w:pPr>
@@ -256,7 +272,6 @@
           <w:p>
             <w:pPr>
               <w:rPr>
-                <w:rFonts w:hint="eastAsia"/>
                 <w:szCs w:val="18"/>
               </w:rPr>
             </w:pPr>
@@ -297,7 +312,6 @@
           <w:p>
             <w:pPr>
               <w:rPr>
-                <w:rFonts w:hint="eastAsia"/>
                 <w:szCs w:val="18"/>
               </w:rPr>
             </w:pPr>
@@ -355,6 +369,12 @@
           <w:insideH w:val="none" w:sz="0" w:space="0" w:color="auto"/>
           <w:insideV w:val="none" w:sz="0" w:space="0" w:color="auto"/>
         </w:tblBorders>
+        <w:tblCellMar>
+          <w:top w:w="57" w:type="dxa"/>
+          <w:left w:w="57" w:type="dxa"/>
+          <w:bottom w:w="57" w:type="dxa"/>
+          <w:right w:w="57" w:type="dxa"/>
+        </w:tblCellMar>
         <w:tblLook w:val="04A0" w:firstRow="1" w:lastRow="0" w:firstColumn="1" w:lastColumn="0" w:noHBand="0" w:noVBand="1"/>
       </w:tblPr>
       <w:tblGrid>
@@ -382,7 +402,7 @@
           </w:p>
           <w:p>
             <w:pPr>
-              <w:ind w:leftChars="400" w:left="720"/>
+              <w:ind w:leftChars="400" w:left="677"/>
               <w:rPr>
                 <w:color w:val="595959" w:themeColor="text1" w:themeTint="A6"/>
                 <w:szCs w:val="18"/>
@@ -399,7 +419,7 @@
           </w:p>
           <w:p>
             <w:pPr>
-              <w:ind w:leftChars="400" w:left="720"/>
+              <w:ind w:leftChars="400" w:left="677"/>
               <w:rPr>
                 <w:color w:val="595959" w:themeColor="text1" w:themeTint="A6"/>
                 <w:szCs w:val="18"/>
@@ -416,7 +436,7 @@
           </w:p>
           <w:p>
             <w:pPr>
-              <w:ind w:leftChars="400" w:left="720"/>
+              <w:ind w:leftChars="400" w:left="677"/>
               <w:rPr>
                 <w:color w:val="595959" w:themeColor="text1" w:themeTint="A6"/>
                 <w:szCs w:val="18"/>
@@ -433,7 +453,7 @@
           </w:p>
           <w:p>
             <w:pPr>
-              <w:ind w:leftChars="400" w:left="720"/>
+              <w:ind w:leftChars="400" w:left="677"/>
               <w:rPr>
                 <w:color w:val="595959" w:themeColor="text1" w:themeTint="A6"/>
                 <w:szCs w:val="18"/>
@@ -451,7 +471,6 @@
           <w:p>
             <w:pPr>
               <w:rPr>
-                <w:rFonts w:hint="eastAsia"/>
                 <w:color w:val="595959" w:themeColor="text1" w:themeTint="A6"/>
                 <w:szCs w:val="18"/>
               </w:rPr>
@@ -506,7 +525,7 @@
           </w:p>
           <w:p>
             <w:pPr>
-              <w:ind w:leftChars="400" w:left="720"/>
+              <w:ind w:leftChars="400" w:left="677"/>
               <w:rPr>
                 <w:color w:val="595959" w:themeColor="text1" w:themeTint="A6"/>
                 <w:szCs w:val="18"/>
@@ -523,7 +542,7 @@
           </w:p>
           <w:p>
             <w:pPr>
-              <w:ind w:leftChars="400" w:left="720"/>
+              <w:ind w:leftChars="400" w:left="677"/>
               <w:rPr>
                 <w:color w:val="595959" w:themeColor="text1" w:themeTint="A6"/>
                 <w:szCs w:val="18"/>
@@ -540,7 +559,7 @@
           </w:p>
           <w:p>
             <w:pPr>
-              <w:ind w:leftChars="400" w:left="720"/>
+              <w:ind w:leftChars="400" w:left="677"/>
               <w:rPr>
                 <w:color w:val="595959" w:themeColor="text1" w:themeTint="A6"/>
                 <w:szCs w:val="18"/>
@@ -557,7 +576,7 @@
           </w:p>
           <w:p>
             <w:pPr>
-              <w:ind w:leftChars="400" w:left="720"/>
+              <w:ind w:leftChars="400" w:left="677"/>
               <w:rPr>
                 <w:color w:val="595959" w:themeColor="text1" w:themeTint="A6"/>
                 <w:szCs w:val="18"/>
@@ -574,7 +593,7 @@
           </w:p>
           <w:p>
             <w:pPr>
-              <w:ind w:leftChars="400" w:left="720"/>
+              <w:ind w:leftChars="400" w:left="677"/>
               <w:rPr>
                 <w:color w:val="595959" w:themeColor="text1" w:themeTint="A6"/>
                 <w:szCs w:val="18"/>
@@ -592,7 +611,6 @@
           <w:p>
             <w:pPr>
               <w:rPr>
-                <w:rFonts w:hint="eastAsia"/>
                 <w:color w:val="595959" w:themeColor="text1" w:themeTint="A6"/>
                 <w:szCs w:val="18"/>
               </w:rPr>
@@ -647,7 +665,7 @@
           </w:p>
           <w:p>
             <w:pPr>
-              <w:ind w:leftChars="400" w:left="720"/>
+              <w:ind w:leftChars="400" w:left="677"/>
               <w:rPr>
                 <w:color w:val="595959" w:themeColor="text1" w:themeTint="A6"/>
                 <w:szCs w:val="18"/>
@@ -664,7 +682,7 @@
           </w:p>
           <w:p>
             <w:pPr>
-              <w:ind w:leftChars="400" w:left="720"/>
+              <w:ind w:leftChars="400" w:left="677"/>
               <w:rPr>
                 <w:color w:val="595959" w:themeColor="text1" w:themeTint="A6"/>
                 <w:szCs w:val="18"/>
@@ -681,7 +699,7 @@
           </w:p>
           <w:p>
             <w:pPr>
-              <w:ind w:leftChars="400" w:left="720"/>
+              <w:ind w:leftChars="400" w:left="677"/>
               <w:rPr>
                 <w:color w:val="595959" w:themeColor="text1" w:themeTint="A6"/>
                 <w:szCs w:val="18"/>
@@ -698,7 +716,7 @@
           </w:p>
           <w:p>
             <w:pPr>
-              <w:ind w:leftChars="400" w:left="720"/>
+              <w:ind w:leftChars="400" w:left="677"/>
               <w:rPr>
                 <w:color w:val="595959" w:themeColor="text1" w:themeTint="A6"/>
                 <w:szCs w:val="18"/>
@@ -716,7 +734,6 @@
           <w:p>
             <w:pPr>
               <w:rPr>
-                <w:rFonts w:hint="eastAsia"/>
                 <w:color w:val="595959" w:themeColor="text1" w:themeTint="A6"/>
                 <w:szCs w:val="18"/>
               </w:rPr>
@@ -771,7 +788,7 @@
           </w:p>
           <w:p>
             <w:pPr>
-              <w:ind w:leftChars="400" w:left="720"/>
+              <w:ind w:leftChars="400" w:left="677"/>
               <w:rPr>
                 <w:color w:val="595959" w:themeColor="text1" w:themeTint="A6"/>
                 <w:szCs w:val="18"/>
@@ -788,7 +805,7 @@
           </w:p>
           <w:p>
             <w:pPr>
-              <w:ind w:leftChars="400" w:left="720"/>
+              <w:ind w:leftChars="400" w:left="677"/>
               <w:rPr>
                 <w:color w:val="595959" w:themeColor="text1" w:themeTint="A6"/>
                 <w:szCs w:val="18"/>
@@ -805,7 +822,7 @@
           </w:p>
           <w:p>
             <w:pPr>
-              <w:ind w:leftChars="400" w:left="720"/>
+              <w:ind w:leftChars="400" w:left="677"/>
               <w:rPr>
                 <w:color w:val="595959" w:themeColor="text1" w:themeTint="A6"/>
                 <w:szCs w:val="18"/>
@@ -822,7 +839,7 @@
           </w:p>
           <w:p>
             <w:pPr>
-              <w:ind w:leftChars="400" w:left="720"/>
+              <w:ind w:leftChars="400" w:left="677"/>
               <w:rPr>
                 <w:color w:val="595959" w:themeColor="text1" w:themeTint="A6"/>
                 <w:szCs w:val="18"/>
@@ -839,7 +856,7 @@
           </w:p>
           <w:p>
             <w:pPr>
-              <w:ind w:leftChars="400" w:left="720"/>
+              <w:ind w:leftChars="400" w:left="677"/>
               <w:rPr>
                 <w:color w:val="595959" w:themeColor="text1" w:themeTint="A6"/>
                 <w:szCs w:val="18"/>
@@ -857,7 +874,6 @@
           <w:p>
             <w:pPr>
               <w:rPr>
-                <w:rFonts w:hint="eastAsia"/>
                 <w:color w:val="595959" w:themeColor="text1" w:themeTint="A6"/>
                 <w:szCs w:val="18"/>
               </w:rPr>
@@ -912,7 +928,7 @@
           </w:p>
           <w:p>
             <w:pPr>
-              <w:ind w:leftChars="400" w:left="720"/>
+              <w:ind w:leftChars="400" w:left="677"/>
               <w:rPr>
                 <w:color w:val="595959" w:themeColor="text1" w:themeTint="A6"/>
                 <w:szCs w:val="18"/>
@@ -929,7 +945,7 @@
           </w:p>
           <w:p>
             <w:pPr>
-              <w:ind w:leftChars="400" w:left="720"/>
+              <w:ind w:leftChars="400" w:left="677"/>
               <w:rPr>
                 <w:color w:val="595959" w:themeColor="text1" w:themeTint="A6"/>
                 <w:szCs w:val="18"/>
@@ -946,7 +962,7 @@
           </w:p>
           <w:p>
             <w:pPr>
-              <w:ind w:leftChars="400" w:left="720"/>
+              <w:ind w:leftChars="400" w:left="677"/>
               <w:rPr>
                 <w:color w:val="595959" w:themeColor="text1" w:themeTint="A6"/>
                 <w:szCs w:val="18"/>
@@ -964,7 +980,6 @@
           <w:p>
             <w:pPr>
               <w:rPr>
-                <w:rFonts w:hint="eastAsia"/>
                 <w:color w:val="595959" w:themeColor="text1" w:themeTint="A6"/>
                 <w:szCs w:val="18"/>
               </w:rPr>
@@ -1019,7 +1034,7 @@
           </w:p>
           <w:p>
             <w:pPr>
-              <w:ind w:leftChars="400" w:left="720"/>
+              <w:ind w:leftChars="400" w:left="677"/>
               <w:rPr>
                 <w:color w:val="595959" w:themeColor="text1" w:themeTint="A6"/>
                 <w:szCs w:val="18"/>
@@ -1036,7 +1051,7 @@
           </w:p>
           <w:p>
             <w:pPr>
-              <w:ind w:leftChars="400" w:left="720"/>
+              <w:ind w:leftChars="400" w:left="677"/>
               <w:rPr>
                 <w:color w:val="595959" w:themeColor="text1" w:themeTint="A6"/>
                 <w:szCs w:val="18"/>
@@ -1053,7 +1068,7 @@
           </w:p>
           <w:p>
             <w:pPr>
-              <w:ind w:leftChars="400" w:left="720"/>
+              <w:ind w:leftChars="400" w:left="677"/>
               <w:rPr>
                 <w:color w:val="595959" w:themeColor="text1" w:themeTint="A6"/>
                 <w:szCs w:val="18"/>
@@ -1070,7 +1085,7 @@
           </w:p>
           <w:p>
             <w:pPr>
-              <w:ind w:leftChars="400" w:left="720"/>
+              <w:ind w:leftChars="400" w:left="677"/>
               <w:rPr>
                 <w:color w:val="595959" w:themeColor="text1" w:themeTint="A6"/>
                 <w:szCs w:val="18"/>
@@ -1088,7 +1103,6 @@
           <w:p>
             <w:pPr>
               <w:rPr>
-                <w:rFonts w:hint="eastAsia"/>
                 <w:color w:val="595959" w:themeColor="text1" w:themeTint="A6"/>
                 <w:szCs w:val="18"/>
               </w:rPr>
@@ -1126,9 +1140,6 @@
     <w:p>
       <w:pPr>
         <w:pStyle w:val="2"/>
-        <w:rPr>
-          <w:rFonts w:hint="eastAsia"/>
-        </w:rPr>
       </w:pPr>
       <w:r>
         <w:rPr>
@@ -1149,6 +1160,12 @@
           <w:insideH w:val="none" w:sz="0" w:space="0" w:color="auto"/>
           <w:insideV w:val="none" w:sz="0" w:space="0" w:color="auto"/>
         </w:tblBorders>
+        <w:tblCellMar>
+          <w:top w:w="57" w:type="dxa"/>
+          <w:left w:w="57" w:type="dxa"/>
+          <w:bottom w:w="57" w:type="dxa"/>
+          <w:right w:w="57" w:type="dxa"/>
+        </w:tblCellMar>
         <w:tblLook w:val="04A0" w:firstRow="1" w:lastRow="0" w:firstColumn="1" w:lastColumn="0" w:noHBand="0" w:noVBand="1"/>
       </w:tblPr>
       <w:tblGrid>
@@ -1176,9 +1193,8 @@
           </w:p>
           <w:p>
             <w:pPr>
-              <w:ind w:leftChars="400" w:left="720"/>
-              <w:rPr>
-                <w:rFonts w:hint="eastAsia"/>
+              <w:ind w:leftChars="400" w:left="677"/>
+              <w:rPr>
                 <w:color w:val="595959" w:themeColor="text1" w:themeTint="A6"/>
                 <w:szCs w:val="18"/>
               </w:rPr>
@@ -1241,9 +1257,8 @@
           </w:p>
           <w:p>
             <w:pPr>
-              <w:ind w:leftChars="400" w:left="720"/>
-              <w:rPr>
-                <w:rFonts w:hint="eastAsia"/>
+              <w:ind w:leftChars="400" w:left="677"/>
+              <w:rPr>
                 <w:color w:val="595959" w:themeColor="text1" w:themeTint="A6"/>
                 <w:szCs w:val="18"/>
               </w:rPr>
@@ -1290,9 +1305,6 @@
       <w:pPr>
         <w:pStyle w:val="2"/>
         <w:ind w:firstLine="0"/>
-        <w:rPr>
-          <w:rFonts w:hint="eastAsia"/>
-        </w:rPr>
       </w:pPr>
     </w:p>
     <w:p>
@@ -1318,6 +1330,12 @@
           <w:insideH w:val="none" w:sz="0" w:space="0" w:color="auto"/>
           <w:insideV w:val="none" w:sz="0" w:space="0" w:color="auto"/>
         </w:tblBorders>
+        <w:tblCellMar>
+          <w:top w:w="57" w:type="dxa"/>
+          <w:left w:w="57" w:type="dxa"/>
+          <w:bottom w:w="57" w:type="dxa"/>
+          <w:right w:w="57" w:type="dxa"/>
+        </w:tblCellMar>
         <w:tblLook w:val="04A0" w:firstRow="1" w:lastRow="0" w:firstColumn="1" w:lastColumn="0" w:noHBand="0" w:noVBand="1"/>
       </w:tblPr>
       <w:tblGrid>
@@ -1332,7 +1350,6 @@
           <w:p>
             <w:pPr>
               <w:rPr>
-                <w:rFonts w:hint="eastAsia"/>
                 <w:szCs w:val="18"/>
               </w:rPr>
             </w:pPr>
@@ -1346,7 +1363,7 @@
           </w:p>
           <w:p>
             <w:pPr>
-              <w:ind w:leftChars="400" w:left="720"/>
+              <w:ind w:leftChars="400" w:left="677"/>
               <w:rPr>
                 <w:color w:val="595959" w:themeColor="text1" w:themeTint="A6"/>
                 <w:szCs w:val="18"/>
@@ -1363,9 +1380,8 @@
           </w:p>
           <w:p>
             <w:pPr>
-              <w:ind w:leftChars="400" w:left="720"/>
-              <w:rPr>
-                <w:rFonts w:hint="eastAsia"/>
+              <w:ind w:leftChars="400" w:left="677"/>
+              <w:rPr>
                 <w:color w:val="595959" w:themeColor="text1" w:themeTint="A6"/>
                 <w:szCs w:val="18"/>
               </w:rPr>
@@ -1415,7 +1431,6 @@
           <w:p>
             <w:pPr>
               <w:rPr>
-                <w:rFonts w:hint="eastAsia"/>
                 <w:szCs w:val="18"/>
               </w:rPr>
             </w:pPr>
@@ -1429,7 +1444,7 @@
           </w:p>
           <w:p>
             <w:pPr>
-              <w:ind w:leftChars="400" w:left="720"/>
+              <w:ind w:leftChars="400" w:left="677"/>
               <w:rPr>
                 <w:color w:val="595959" w:themeColor="text1" w:themeTint="A6"/>
                 <w:szCs w:val="18"/>
@@ -1446,9 +1461,8 @@
           </w:p>
           <w:p>
             <w:pPr>
-              <w:ind w:leftChars="400" w:left="720"/>
-              <w:rPr>
-                <w:rFonts w:hint="eastAsia"/>
+              <w:ind w:leftChars="400" w:left="677"/>
+              <w:rPr>
                 <w:color w:val="595959" w:themeColor="text1" w:themeTint="A6"/>
                 <w:szCs w:val="18"/>
               </w:rPr>
@@ -1491,19 +1505,10 @@
         </w:tc>
       </w:tr>
     </w:tbl>
-    <w:p>
-      <w:pPr>
-        <w:rPr>
-          <w:rFonts w:hint="eastAsia"/>
-        </w:rPr>
-      </w:pPr>
-    </w:p>
+    <w:p/>
     <w:p>
       <w:pPr>
         <w:pStyle w:val="2"/>
-        <w:rPr>
-          <w:rFonts w:hint="eastAsia"/>
-        </w:rPr>
       </w:pPr>
       <w:r>
         <w:rPr>
@@ -1524,6 +1529,12 @@
           <w:insideH w:val="none" w:sz="0" w:space="0" w:color="auto"/>
           <w:insideV w:val="none" w:sz="0" w:space="0" w:color="auto"/>
         </w:tblBorders>
+        <w:tblCellMar>
+          <w:top w:w="57" w:type="dxa"/>
+          <w:left w:w="57" w:type="dxa"/>
+          <w:bottom w:w="57" w:type="dxa"/>
+          <w:right w:w="57" w:type="dxa"/>
+        </w:tblCellMar>
         <w:tblLook w:val="04A0" w:firstRow="1" w:lastRow="0" w:firstColumn="1" w:lastColumn="0" w:noHBand="0" w:noVBand="1"/>
       </w:tblPr>
       <w:tblGrid>
@@ -1538,7 +1549,6 @@
           <w:p>
             <w:pPr>
               <w:rPr>
-                <w:rFonts w:hint="eastAsia"/>
                 <w:szCs w:val="18"/>
               </w:rPr>
             </w:pPr>
@@ -1579,7 +1589,6 @@
           <w:p>
             <w:pPr>
               <w:rPr>
-                <w:rFonts w:hint="eastAsia"/>
                 <w:szCs w:val="18"/>
               </w:rPr>
             </w:pPr>
@@ -1620,7 +1629,6 @@
           <w:p>
             <w:pPr>
               <w:rPr>
-                <w:rFonts w:hint="eastAsia"/>
                 <w:szCs w:val="18"/>
               </w:rPr>
             </w:pPr>
@@ -2161,7 +2169,7 @@
   <w:style w:type="paragraph" w:default="1" w:styleId="a">
     <w:name w:val="Normal"/>
     <w:qFormat/>
-    <w:rsid w:val="005057FC"/>
+    <w:rsid w:val="006373C6"/>
     <w:pPr>
       <w:widowControl w:val="0"/>
       <w:wordWrap w:val="0"/>
@@ -2170,6 +2178,7 @@
       <w:spacing w:line="288" w:lineRule="auto"/>
     </w:pPr>
     <w:rPr>
+      <w:rFonts w:eastAsia="NanumGothic"/>
       <w:sz w:val="18"/>
     </w:rPr>
   </w:style>

</xml_diff>

<commit_message>
feat: add construction safety training to education section
Co-Authored-By: Claude <noreply@anthropic.com>
</commit_message>
<xml_diff>
--- a/data/ko/HyeonseungKang-Portfolio.docx
+++ b/data/ko/HyeonseungKang-Portfolio.docx
@@ -1334,6 +1334,74 @@
                 <w:szCs w:val="18"/>
               </w:rPr>
               <w:t xml:space="preserve">아주대학교 AI부트캠프사업단</w:t>
+            </w:r>
+          </w:p>
+        </w:tc>
+        <w:tc>
+          <w:tcPr>
+            <w:tcW w:w="2070" w:type="dxa"/>
+          </w:tcPr>
+          <w:p>
+            <w:pPr>
+              <w:rPr>
+                <w:rFonts w:ascii="나눔고딕" w:hAnsi="나눔고딕"/>
+                <w:szCs w:val="18"/>
+              </w:rPr>
+            </w:pPr>
+            <w:r>
+              <w:rPr>
+                <w:rFonts w:ascii="나눔고딕" w:hAnsi="나눔고딕" w:hint="eastAsia"/>
+                <w:szCs w:val="18"/>
+              </w:rPr>
+              <w:t xml:space="preserve">2026. 8.</w:t>
+            </w:r>
+          </w:p>
+          <w:p>
+            <w:pPr>
+              <w:rPr>
+                <w:rFonts w:ascii="나눔고딕" w:hAnsi="나눔고딕"/>
+                <w:szCs w:val="18"/>
+              </w:rPr>
+            </w:pPr>
+          </w:p>
+        </w:tc>
+      </w:tr>
+      <w:tr>
+        <w:tc>
+          <w:tcPr>
+            <w:tcW w:w="6946" w:type="dxa"/>
+          </w:tcPr>
+          <w:p>
+            <w:pPr>
+              <w:rPr>
+                <w:rFonts w:ascii="나눔고딕" w:hAnsi="나눔고딕"/>
+                <w:szCs w:val="18"/>
+              </w:rPr>
+            </w:pPr>
+            <w:r>
+              <w:rPr>
+                <w:rFonts w:ascii="나눔고딕" w:hAnsi="나눔고딕" w:hint="eastAsia"/>
+                <w:szCs w:val="18"/>
+              </w:rPr>
+              <w:t xml:space="preserve">건설업 기초안전보건교육</w:t>
+            </w:r>
+          </w:p>
+          <w:p>
+            <w:pPr>
+              <w:ind w:leftChars="400" w:left="677"/>
+              <w:rPr>
+                <w:rFonts w:ascii="나눔고딕" w:hAnsi="나눔고딕"/>
+                <w:color w:val="595959" w:themeColor="text1" w:themeTint="A6"/>
+                <w:szCs w:val="18"/>
+              </w:rPr>
+            </w:pPr>
+            <w:r>
+              <w:rPr>
+                <w:rFonts w:ascii="나눔고딕" w:hAnsi="나눔고딕" w:hint="eastAsia"/>
+                <w:color w:val="595959" w:themeColor="text1" w:themeTint="A6"/>
+                <w:szCs w:val="18"/>
+              </w:rPr>
+              <w:t xml:space="preserve">카이스건설기술교육</w:t>
             </w:r>
           </w:p>
         </w:tc>

</xml_diff>